<commit_message>
Clarify opt in language for subscriptions
</commit_message>
<xml_diff>
--- a/docs/SMS Registration.docx
+++ b/docs/SMS Registration.docx
@@ -35,10 +35,10 @@
     <w:p>
       <w:r>
         <w:drawing>
-          <wp:inline distT="0" distB="0" distL="0" distR="0" wp14:anchorId="16A24E81" wp14:editId="2A754A65">
-            <wp:extent cx="5943600" cy="2617470"/>
+          <wp:inline distT="0" distB="0" distL="0" distR="0" wp14:anchorId="5F573065" wp14:editId="710110A4">
+            <wp:extent cx="5943600" cy="2597150"/>
             <wp:effectExtent l="0" t="0" r="0" b="0"/>
-            <wp:docPr id="832676938" name="Picture 1"/>
+            <wp:docPr id="769157384" name="Picture 1"/>
             <wp:cNvGraphicFramePr>
               <a:graphicFrameLocks xmlns:a="http://schemas.openxmlformats.org/drawingml/2006/main" noChangeAspect="1"/>
             </wp:cNvGraphicFramePr>
@@ -46,7 +46,7 @@
               <a:graphicData uri="http://schemas.openxmlformats.org/drawingml/2006/picture">
                 <pic:pic xmlns:pic="http://schemas.openxmlformats.org/drawingml/2006/picture">
                   <pic:nvPicPr>
-                    <pic:cNvPr id="832676938" name=""/>
+                    <pic:cNvPr id="769157384" name=""/>
                     <pic:cNvPicPr/>
                   </pic:nvPicPr>
                   <pic:blipFill>
@@ -58,7 +58,7 @@
                   <pic:spPr>
                     <a:xfrm>
                       <a:off x="0" y="0"/>
-                      <a:ext cx="5943600" cy="2617470"/>
+                      <a:ext cx="5943600" cy="2597150"/>
                     </a:xfrm>
                     <a:prstGeom prst="rect">
                       <a:avLst/>
@@ -152,6 +152,9 @@
     </w:p>
     <w:p>
       <w:r>
+        <w:rPr>
+          <w:noProof/>
+        </w:rPr>
         <w:drawing>
           <wp:inline distT="0" distB="0" distL="0" distR="0" wp14:anchorId="00AD9A60" wp14:editId="7674A5AC">
             <wp:extent cx="5943600" cy="2239010"/>
@@ -192,10 +195,7 @@
     <w:p>
       <w:r>
         <w:lastRenderedPageBreak/>
-        <w:t>Users will enter their company credentials. The service will verify those credentials</w:t>
-      </w:r>
-      <w:r>
-        <w:t xml:space="preserve"> and then delete the user entry from the database to confirm that user has been unsubscribed.</w:t>
+        <w:t>Users will enter their company credentials. The service will verify those credentials and then delete the user entry from the database to confirm that user has been unsubscribed.</w:t>
       </w:r>
     </w:p>
     <w:sectPr>

</xml_diff>